<commit_message>
Edited callback methods and added stack implementation
</commit_message>
<xml_diff>
--- a/d8_callback_and_lambda_funtions_of_flutter.docx
+++ b/d8_callback_and_lambda_funtions_of_flutter.docx
@@ -104,23 +104,7 @@
           <w:sz w:val="32"/>
           <w:szCs w:val="32"/>
         </w:rPr>
-        <w:t xml:space="preserve"> it does not return a value, but it may take a parameter. 3 common functions </w:t>
-      </w:r>
-      <w:proofErr w:type="gramStart"/>
-      <w:r>
-        <w:rPr>
-          <w:sz w:val="32"/>
-          <w:szCs w:val="32"/>
-        </w:rPr>
-        <w:t>are :</w:t>
-      </w:r>
-      <w:proofErr w:type="gramEnd"/>
-      <w:r>
-        <w:rPr>
-          <w:sz w:val="32"/>
-          <w:szCs w:val="32"/>
-        </w:rPr>
-        <w:t>-</w:t>
+        <w:t xml:space="preserve"> it does not return a value, but it may take a parameter. 3 common functions are :-</w:t>
       </w:r>
     </w:p>
     <w:p>
@@ -476,7 +460,6 @@
         <w:t xml:space="preserve">void </w:t>
       </w:r>
       <w:proofErr w:type="spellStart"/>
-      <w:proofErr w:type="gramStart"/>
       <w:r>
         <w:rPr>
           <w:b/>
@@ -496,18 +479,7 @@
           <w:sz w:val="32"/>
           <w:szCs w:val="32"/>
         </w:rPr>
-        <w:t>(</w:t>
-      </w:r>
-      <w:proofErr w:type="gramEnd"/>
-      <w:r>
-        <w:rPr>
-          <w:b/>
-          <w:bCs/>
-          <w:color w:val="D86DCB" w:themeColor="accent5" w:themeTint="99"/>
-          <w:sz w:val="32"/>
-          <w:szCs w:val="32"/>
-        </w:rPr>
-        <w:t xml:space="preserve">{required </w:t>
+        <w:t xml:space="preserve">({required </w:t>
       </w:r>
       <w:proofErr w:type="spellStart"/>
       <w:r>
@@ -681,7 +653,6 @@
         <w:t xml:space="preserve">final provider = </w:t>
       </w:r>
       <w:proofErr w:type="spellStart"/>
-      <w:proofErr w:type="gramStart"/>
       <w:r>
         <w:rPr>
           <w:b/>
@@ -693,7 +664,6 @@
         <w:t>context.read</w:t>
       </w:r>
       <w:proofErr w:type="spellEnd"/>
-      <w:proofErr w:type="gramEnd"/>
       <w:r>
         <w:rPr>
           <w:b/>
@@ -739,7 +709,6 @@
         </w:rPr>
       </w:pPr>
       <w:proofErr w:type="spellStart"/>
-      <w:proofErr w:type="gramStart"/>
       <w:r>
         <w:rPr>
           <w:b/>
@@ -751,7 +720,6 @@
         <w:t>provider.getValue</w:t>
       </w:r>
       <w:proofErr w:type="spellEnd"/>
-      <w:proofErr w:type="gramEnd"/>
       <w:r>
         <w:rPr>
           <w:b/>
@@ -1119,113 +1087,77 @@
           <w:sz w:val="32"/>
           <w:szCs w:val="32"/>
         </w:rPr>
+        <w:t xml:space="preserve"> F</w:t>
+      </w:r>
+      <w:r>
+        <w:rPr>
+          <w:sz w:val="32"/>
+          <w:szCs w:val="32"/>
+        </w:rPr>
+        <w:t>unction</w:t>
+      </w:r>
+      <w:r>
+        <w:rPr>
+          <w:sz w:val="32"/>
+          <w:szCs w:val="32"/>
+        </w:rPr>
+        <w:t>()</w:t>
+      </w:r>
+      <w:r>
+        <w:rPr>
+          <w:sz w:val="32"/>
+          <w:szCs w:val="32"/>
+        </w:rPr>
+        <w:t xml:space="preserve"> as </w:t>
+      </w:r>
+      <w:r>
+        <w:rPr>
+          <w:sz w:val="32"/>
+          <w:szCs w:val="32"/>
+        </w:rPr>
+        <w:t>parameter for Calling it:</w:t>
+      </w:r>
+    </w:p>
+    <w:p>
+      <w:pPr>
+        <w:jc w:val="both"/>
+        <w:rPr>
+          <w:sz w:val="32"/>
+          <w:szCs w:val="32"/>
+        </w:rPr>
+      </w:pPr>
+      <w:r>
+        <w:rPr>
+          <w:sz w:val="32"/>
+          <w:szCs w:val="32"/>
+        </w:rPr>
+        <w:t xml:space="preserve"># </w:t>
+      </w:r>
+      <w:r>
+        <w:rPr>
+          <w:sz w:val="32"/>
+          <w:szCs w:val="32"/>
+        </w:rPr>
+        <w:t xml:space="preserve">We can also pass a function as parameter or argument of a class or function specifying the data type </w:t>
+      </w:r>
+      <w:r>
+        <w:rPr>
+          <w:b/>
+          <w:bCs/>
+          <w:sz w:val="32"/>
+          <w:szCs w:val="32"/>
+        </w:rPr>
+        <w:t>Future&lt;void&gt; Function()</w:t>
+      </w:r>
+      <w:r>
+        <w:rPr>
+          <w:b/>
+          <w:bCs/>
+          <w:sz w:val="32"/>
+          <w:szCs w:val="32"/>
+        </w:rPr>
         <w:t xml:space="preserve"> </w:t>
       </w:r>
-      <w:proofErr w:type="gramStart"/>
-      <w:r>
-        <w:rPr>
-          <w:sz w:val="32"/>
-          <w:szCs w:val="32"/>
-        </w:rPr>
-        <w:t>F</w:t>
-      </w:r>
-      <w:r>
-        <w:rPr>
-          <w:sz w:val="32"/>
-          <w:szCs w:val="32"/>
-        </w:rPr>
-        <w:t>unction</w:t>
-      </w:r>
-      <w:r>
-        <w:rPr>
-          <w:sz w:val="32"/>
-          <w:szCs w:val="32"/>
-        </w:rPr>
-        <w:t>(</w:t>
-      </w:r>
-      <w:proofErr w:type="gramEnd"/>
-      <w:r>
-        <w:rPr>
-          <w:sz w:val="32"/>
-          <w:szCs w:val="32"/>
-        </w:rPr>
-        <w:t>)</w:t>
-      </w:r>
-      <w:r>
-        <w:rPr>
-          <w:sz w:val="32"/>
-          <w:szCs w:val="32"/>
-        </w:rPr>
-        <w:t xml:space="preserve"> as </w:t>
-      </w:r>
-      <w:r>
-        <w:rPr>
-          <w:sz w:val="32"/>
-          <w:szCs w:val="32"/>
-        </w:rPr>
-        <w:t>parameter for Calling it:</w:t>
-      </w:r>
-    </w:p>
-    <w:p>
-      <w:pPr>
-        <w:jc w:val="both"/>
-        <w:rPr>
-          <w:sz w:val="32"/>
-          <w:szCs w:val="32"/>
-        </w:rPr>
-      </w:pPr>
-      <w:r>
-        <w:rPr>
-          <w:sz w:val="32"/>
-          <w:szCs w:val="32"/>
-        </w:rPr>
-        <w:t xml:space="preserve"># </w:t>
-      </w:r>
-      <w:r>
-        <w:rPr>
-          <w:sz w:val="32"/>
-          <w:szCs w:val="32"/>
-        </w:rPr>
-        <w:t xml:space="preserve">We can also pass a function as parameter or argument of a class or function specifying the data type </w:t>
-      </w:r>
-      <w:r>
-        <w:rPr>
-          <w:b/>
-          <w:bCs/>
-          <w:sz w:val="32"/>
-          <w:szCs w:val="32"/>
-        </w:rPr>
-        <w:t xml:space="preserve">Future&lt;void&gt; </w:t>
-      </w:r>
-      <w:proofErr w:type="gramStart"/>
-      <w:r>
-        <w:rPr>
-          <w:b/>
-          <w:bCs/>
-          <w:sz w:val="32"/>
-          <w:szCs w:val="32"/>
-        </w:rPr>
-        <w:t>Function(</w:t>
-      </w:r>
-      <w:proofErr w:type="gramEnd"/>
-      <w:r>
-        <w:rPr>
-          <w:b/>
-          <w:bCs/>
-          <w:sz w:val="32"/>
-          <w:szCs w:val="32"/>
-        </w:rPr>
-        <w:t>)</w:t>
-      </w:r>
-      <w:r>
-        <w:rPr>
-          <w:b/>
-          <w:bCs/>
-          <w:sz w:val="32"/>
-          <w:szCs w:val="32"/>
-        </w:rPr>
-        <w:t xml:space="preserve"> </w:t>
-      </w:r>
       <w:r>
         <w:rPr>
           <w:sz w:val="32"/>
@@ -1319,29 +1251,7 @@
           <w:sz w:val="32"/>
           <w:szCs w:val="32"/>
         </w:rPr>
-        <w:t xml:space="preserve">  final Future&lt;void&gt; </w:t>
-      </w:r>
-      <w:proofErr w:type="gramStart"/>
-      <w:r>
-        <w:rPr>
-          <w:b/>
-          <w:bCs/>
-          <w:color w:val="D86DCB" w:themeColor="accent5" w:themeTint="99"/>
-          <w:sz w:val="32"/>
-          <w:szCs w:val="32"/>
-        </w:rPr>
-        <w:t>Function(</w:t>
-      </w:r>
-      <w:proofErr w:type="gramEnd"/>
-      <w:r>
-        <w:rPr>
-          <w:b/>
-          <w:bCs/>
-          <w:color w:val="D86DCB" w:themeColor="accent5" w:themeTint="99"/>
-          <w:sz w:val="32"/>
-          <w:szCs w:val="32"/>
-        </w:rPr>
-        <w:t xml:space="preserve">) </w:t>
+        <w:t xml:space="preserve">  final Future&lt;void&gt; Function() </w:t>
       </w:r>
       <w:proofErr w:type="spellStart"/>
       <w:r>
@@ -1388,7 +1298,6 @@
         <w:t xml:space="preserve">  const </w:t>
       </w:r>
       <w:proofErr w:type="spellStart"/>
-      <w:proofErr w:type="gramStart"/>
       <w:r>
         <w:rPr>
           <w:b/>
@@ -1408,18 +1317,7 @@
           <w:sz w:val="32"/>
           <w:szCs w:val="32"/>
         </w:rPr>
-        <w:t>(</w:t>
-      </w:r>
-      <w:proofErr w:type="gramEnd"/>
-      <w:r>
-        <w:rPr>
-          <w:b/>
-          <w:bCs/>
-          <w:color w:val="D86DCB" w:themeColor="accent5" w:themeTint="99"/>
-          <w:sz w:val="32"/>
-          <w:szCs w:val="32"/>
-        </w:rPr>
-        <w:t>{</w:t>
+        <w:t>({</w:t>
       </w:r>
     </w:p>
     <w:p>
@@ -1489,7 +1387,6 @@
         <w:t xml:space="preserve">    required </w:t>
       </w:r>
       <w:proofErr w:type="spellStart"/>
-      <w:proofErr w:type="gramStart"/>
       <w:r>
         <w:rPr>
           <w:b/>
@@ -1501,7 +1398,6 @@
         <w:t>this.fetchProductsData</w:t>
       </w:r>
       <w:proofErr w:type="spellEnd"/>
-      <w:proofErr w:type="gramEnd"/>
       <w:r>
         <w:rPr>
           <w:b/>
@@ -1605,35 +1501,692 @@
       <w:pPr>
         <w:jc w:val="both"/>
         <w:rPr>
-          <w:sz w:val="32"/>
-          <w:szCs w:val="32"/>
-        </w:rPr>
-      </w:pPr>
-    </w:p>
-    <w:p>
-      <w:pPr>
-        <w:jc w:val="both"/>
-        <w:rPr>
-          <w:sz w:val="32"/>
-          <w:szCs w:val="32"/>
-        </w:rPr>
-      </w:pPr>
-      <w:r>
-        <w:rPr>
-          <w:sz w:val="32"/>
-          <w:szCs w:val="32"/>
-        </w:rPr>
-        <w:t xml:space="preserve">Note: Use this when we want to get the latest data from a class instead of using the old one. </w:t>
-      </w:r>
-      <w:proofErr w:type="spellStart"/>
-      <w:r>
-        <w:rPr>
-          <w:sz w:val="32"/>
-          <w:szCs w:val="32"/>
-        </w:rPr>
-        <w:t>Its</w:t>
-      </w:r>
-      <w:proofErr w:type="spellEnd"/>
+          <w:b/>
+          <w:bCs/>
+          <w:color w:val="D86DCB" w:themeColor="accent5" w:themeTint="99"/>
+          <w:sz w:val="32"/>
+          <w:szCs w:val="32"/>
+        </w:rPr>
+      </w:pPr>
+      <w:r>
+        <w:rPr>
+          <w:b/>
+          <w:bCs/>
+          <w:color w:val="D86DCB" w:themeColor="accent5" w:themeTint="99"/>
+          <w:sz w:val="32"/>
+          <w:szCs w:val="32"/>
+        </w:rPr>
+        <w:t xml:space="preserve">// or </w:t>
+      </w:r>
+    </w:p>
+    <w:p>
+      <w:pPr>
+        <w:jc w:val="both"/>
+        <w:rPr>
+          <w:b/>
+          <w:bCs/>
+          <w:color w:val="D86DCB" w:themeColor="accent5" w:themeTint="99"/>
+          <w:sz w:val="32"/>
+          <w:szCs w:val="32"/>
+        </w:rPr>
+      </w:pPr>
+      <w:r>
+        <w:rPr>
+          <w:b/>
+          <w:bCs/>
+          <w:color w:val="D86DCB" w:themeColor="accent5" w:themeTint="99"/>
+          <w:sz w:val="32"/>
+          <w:szCs w:val="32"/>
+        </w:rPr>
+        <w:t xml:space="preserve">class </w:t>
+      </w:r>
+      <w:proofErr w:type="spellStart"/>
+      <w:r>
+        <w:rPr>
+          <w:b/>
+          <w:bCs/>
+          <w:color w:val="D86DCB" w:themeColor="accent5" w:themeTint="99"/>
+          <w:sz w:val="32"/>
+          <w:szCs w:val="32"/>
+        </w:rPr>
+        <w:t>AuthProvider</w:t>
+      </w:r>
+      <w:proofErr w:type="spellEnd"/>
+      <w:r>
+        <w:rPr>
+          <w:b/>
+          <w:bCs/>
+          <w:color w:val="D86DCB" w:themeColor="accent5" w:themeTint="99"/>
+          <w:sz w:val="32"/>
+          <w:szCs w:val="32"/>
+        </w:rPr>
+        <w:t xml:space="preserve"> {</w:t>
+      </w:r>
+    </w:p>
+    <w:p>
+      <w:pPr>
+        <w:jc w:val="both"/>
+        <w:rPr>
+          <w:b/>
+          <w:bCs/>
+          <w:color w:val="D86DCB" w:themeColor="accent5" w:themeTint="99"/>
+          <w:sz w:val="32"/>
+          <w:szCs w:val="32"/>
+        </w:rPr>
+      </w:pPr>
+      <w:r>
+        <w:rPr>
+          <w:b/>
+          <w:bCs/>
+          <w:color w:val="D86DCB" w:themeColor="accent5" w:themeTint="99"/>
+          <w:sz w:val="32"/>
+          <w:szCs w:val="32"/>
+        </w:rPr>
+        <w:t xml:space="preserve">     static String? get token =&gt; _token;</w:t>
+      </w:r>
+    </w:p>
+    <w:p>
+      <w:pPr>
+        <w:jc w:val="both"/>
+        <w:rPr>
+          <w:b/>
+          <w:bCs/>
+          <w:color w:val="D86DCB" w:themeColor="accent5" w:themeTint="99"/>
+          <w:sz w:val="32"/>
+          <w:szCs w:val="32"/>
+        </w:rPr>
+      </w:pPr>
+      <w:r>
+        <w:rPr>
+          <w:b/>
+          <w:bCs/>
+          <w:color w:val="D86DCB" w:themeColor="accent5" w:themeTint="99"/>
+          <w:sz w:val="32"/>
+          <w:szCs w:val="32"/>
+        </w:rPr>
+        <w:t xml:space="preserve">     </w:t>
+      </w:r>
+      <w:r>
+        <w:rPr>
+          <w:b/>
+          <w:bCs/>
+          <w:color w:val="D86DCB" w:themeColor="accent5" w:themeTint="99"/>
+          <w:sz w:val="32"/>
+          <w:szCs w:val="32"/>
+        </w:rPr>
+        <w:t>…</w:t>
+      </w:r>
+    </w:p>
+    <w:p>
+      <w:pPr>
+        <w:jc w:val="both"/>
+        <w:rPr>
+          <w:b/>
+          <w:bCs/>
+          <w:color w:val="D86DCB" w:themeColor="accent5" w:themeTint="99"/>
+          <w:sz w:val="32"/>
+          <w:szCs w:val="32"/>
+        </w:rPr>
+      </w:pPr>
+      <w:r>
+        <w:rPr>
+          <w:b/>
+          <w:bCs/>
+          <w:color w:val="D86DCB" w:themeColor="accent5" w:themeTint="99"/>
+          <w:sz w:val="32"/>
+          <w:szCs w:val="32"/>
+        </w:rPr>
+        <w:t>}</w:t>
+      </w:r>
+    </w:p>
+    <w:p>
+      <w:pPr>
+        <w:jc w:val="both"/>
+        <w:rPr>
+          <w:b/>
+          <w:bCs/>
+          <w:color w:val="D86DCB" w:themeColor="accent5" w:themeTint="99"/>
+          <w:sz w:val="32"/>
+          <w:szCs w:val="32"/>
+        </w:rPr>
+      </w:pPr>
+      <w:r>
+        <w:rPr>
+          <w:b/>
+          <w:bCs/>
+          <w:color w:val="D86DCB" w:themeColor="accent5" w:themeTint="99"/>
+          <w:sz w:val="32"/>
+          <w:szCs w:val="32"/>
+        </w:rPr>
+        <w:t xml:space="preserve">class </w:t>
+      </w:r>
+      <w:proofErr w:type="spellStart"/>
+      <w:r>
+        <w:rPr>
+          <w:b/>
+          <w:bCs/>
+          <w:color w:val="D86DCB" w:themeColor="accent5" w:themeTint="99"/>
+          <w:sz w:val="32"/>
+          <w:szCs w:val="32"/>
+        </w:rPr>
+        <w:t>APICaller</w:t>
+      </w:r>
+      <w:proofErr w:type="spellEnd"/>
+      <w:r>
+        <w:rPr>
+          <w:b/>
+          <w:bCs/>
+          <w:color w:val="D86DCB" w:themeColor="accent5" w:themeTint="99"/>
+          <w:sz w:val="32"/>
+          <w:szCs w:val="32"/>
+        </w:rPr>
+        <w:t xml:space="preserve"> {</w:t>
+      </w:r>
+    </w:p>
+    <w:p>
+      <w:pPr>
+        <w:jc w:val="both"/>
+        <w:rPr>
+          <w:b/>
+          <w:bCs/>
+          <w:color w:val="D86DCB" w:themeColor="accent5" w:themeTint="99"/>
+          <w:sz w:val="32"/>
+          <w:szCs w:val="32"/>
+        </w:rPr>
+      </w:pPr>
+      <w:r>
+        <w:rPr>
+          <w:b/>
+          <w:bCs/>
+          <w:color w:val="D86DCB" w:themeColor="accent5" w:themeTint="99"/>
+          <w:sz w:val="32"/>
+          <w:szCs w:val="32"/>
+        </w:rPr>
+        <w:t xml:space="preserve">     </w:t>
+      </w:r>
+      <w:r>
+        <w:rPr>
+          <w:b/>
+          <w:bCs/>
+          <w:color w:val="D86DCB" w:themeColor="accent5" w:themeTint="99"/>
+          <w:sz w:val="32"/>
+          <w:szCs w:val="32"/>
+        </w:rPr>
+        <w:t xml:space="preserve">final String? Function() </w:t>
+      </w:r>
+      <w:proofErr w:type="spellStart"/>
+      <w:r>
+        <w:rPr>
+          <w:b/>
+          <w:bCs/>
+          <w:color w:val="D86DCB" w:themeColor="accent5" w:themeTint="99"/>
+          <w:sz w:val="32"/>
+          <w:szCs w:val="32"/>
+        </w:rPr>
+        <w:t>getT</w:t>
+      </w:r>
+      <w:r>
+        <w:rPr>
+          <w:b/>
+          <w:bCs/>
+          <w:color w:val="D86DCB" w:themeColor="accent5" w:themeTint="99"/>
+          <w:sz w:val="32"/>
+          <w:szCs w:val="32"/>
+        </w:rPr>
+        <w:t>oken</w:t>
+      </w:r>
+      <w:proofErr w:type="spellEnd"/>
+      <w:r>
+        <w:rPr>
+          <w:b/>
+          <w:bCs/>
+          <w:color w:val="D86DCB" w:themeColor="accent5" w:themeTint="99"/>
+          <w:sz w:val="32"/>
+          <w:szCs w:val="32"/>
+        </w:rPr>
+        <w:t>;</w:t>
+      </w:r>
+    </w:p>
+    <w:p>
+      <w:pPr>
+        <w:jc w:val="both"/>
+        <w:rPr>
+          <w:b/>
+          <w:bCs/>
+          <w:color w:val="D86DCB" w:themeColor="accent5" w:themeTint="99"/>
+          <w:sz w:val="32"/>
+          <w:szCs w:val="32"/>
+        </w:rPr>
+      </w:pPr>
+      <w:r>
+        <w:rPr>
+          <w:b/>
+          <w:bCs/>
+          <w:color w:val="D86DCB" w:themeColor="accent5" w:themeTint="99"/>
+          <w:sz w:val="32"/>
+          <w:szCs w:val="32"/>
+        </w:rPr>
+        <w:t xml:space="preserve">     </w:t>
+      </w:r>
+      <w:proofErr w:type="spellStart"/>
+      <w:r>
+        <w:rPr>
+          <w:b/>
+          <w:bCs/>
+          <w:color w:val="D86DCB" w:themeColor="accent5" w:themeTint="99"/>
+          <w:sz w:val="32"/>
+          <w:szCs w:val="32"/>
+        </w:rPr>
+        <w:t>APICaller</w:t>
+      </w:r>
+      <w:proofErr w:type="spellEnd"/>
+      <w:r>
+        <w:rPr>
+          <w:b/>
+          <w:bCs/>
+          <w:color w:val="D86DCB" w:themeColor="accent5" w:themeTint="99"/>
+          <w:sz w:val="32"/>
+          <w:szCs w:val="32"/>
+        </w:rPr>
+        <w:t xml:space="preserve">({required </w:t>
+      </w:r>
+      <w:proofErr w:type="spellStart"/>
+      <w:r>
+        <w:rPr>
+          <w:b/>
+          <w:bCs/>
+          <w:color w:val="D86DCB" w:themeColor="accent5" w:themeTint="99"/>
+          <w:sz w:val="32"/>
+          <w:szCs w:val="32"/>
+        </w:rPr>
+        <w:t>this.token</w:t>
+      </w:r>
+      <w:proofErr w:type="spellEnd"/>
+      <w:r>
+        <w:rPr>
+          <w:b/>
+          <w:bCs/>
+          <w:color w:val="D86DCB" w:themeColor="accent5" w:themeTint="99"/>
+          <w:sz w:val="32"/>
+          <w:szCs w:val="32"/>
+        </w:rPr>
+        <w:t>);</w:t>
+      </w:r>
+    </w:p>
+    <w:p>
+      <w:pPr>
+        <w:jc w:val="both"/>
+        <w:rPr>
+          <w:b/>
+          <w:bCs/>
+          <w:color w:val="D86DCB" w:themeColor="accent5" w:themeTint="99"/>
+          <w:sz w:val="32"/>
+          <w:szCs w:val="32"/>
+        </w:rPr>
+      </w:pPr>
+      <w:r>
+        <w:rPr>
+          <w:b/>
+          <w:bCs/>
+          <w:color w:val="D86DCB" w:themeColor="accent5" w:themeTint="99"/>
+          <w:sz w:val="32"/>
+          <w:szCs w:val="32"/>
+        </w:rPr>
+        <w:t xml:space="preserve">     </w:t>
+      </w:r>
+      <w:r>
+        <w:rPr>
+          <w:b/>
+          <w:bCs/>
+          <w:color w:val="D86DCB" w:themeColor="accent5" w:themeTint="99"/>
+          <w:sz w:val="32"/>
+          <w:szCs w:val="32"/>
+        </w:rPr>
+        <w:t>…</w:t>
+      </w:r>
+    </w:p>
+    <w:p>
+      <w:pPr>
+        <w:jc w:val="both"/>
+        <w:rPr>
+          <w:b/>
+          <w:bCs/>
+          <w:color w:val="D86DCB" w:themeColor="accent5" w:themeTint="99"/>
+          <w:sz w:val="32"/>
+          <w:szCs w:val="32"/>
+        </w:rPr>
+      </w:pPr>
+      <w:r>
+        <w:rPr>
+          <w:b/>
+          <w:bCs/>
+          <w:color w:val="D86DCB" w:themeColor="accent5" w:themeTint="99"/>
+          <w:sz w:val="32"/>
+          <w:szCs w:val="32"/>
+        </w:rPr>
+        <w:t xml:space="preserve">     </w:t>
+      </w:r>
+      <w:r>
+        <w:rPr>
+          <w:b/>
+          <w:bCs/>
+          <w:color w:val="D86DCB" w:themeColor="accent5" w:themeTint="99"/>
+          <w:sz w:val="32"/>
+          <w:szCs w:val="32"/>
+        </w:rPr>
+        <w:t>{</w:t>
+      </w:r>
+    </w:p>
+    <w:p>
+      <w:pPr>
+        <w:jc w:val="both"/>
+        <w:rPr>
+          <w:b/>
+          <w:bCs/>
+          <w:color w:val="D86DCB" w:themeColor="accent5" w:themeTint="99"/>
+          <w:sz w:val="32"/>
+          <w:szCs w:val="32"/>
+        </w:rPr>
+      </w:pPr>
+      <w:r>
+        <w:rPr>
+          <w:b/>
+          <w:bCs/>
+          <w:color w:val="D86DCB" w:themeColor="accent5" w:themeTint="99"/>
+          <w:sz w:val="32"/>
+          <w:szCs w:val="32"/>
+        </w:rPr>
+        <w:t xml:space="preserve">     </w:t>
+      </w:r>
+      <w:r>
+        <w:rPr>
+          <w:b/>
+          <w:bCs/>
+          <w:color w:val="D86DCB" w:themeColor="accent5" w:themeTint="99"/>
+          <w:sz w:val="32"/>
+          <w:szCs w:val="32"/>
+        </w:rPr>
+        <w:t xml:space="preserve">   “token” : </w:t>
+      </w:r>
+      <w:proofErr w:type="spellStart"/>
+      <w:r>
+        <w:rPr>
+          <w:b/>
+          <w:bCs/>
+          <w:color w:val="D86DCB" w:themeColor="accent5" w:themeTint="99"/>
+          <w:sz w:val="32"/>
+          <w:szCs w:val="32"/>
+        </w:rPr>
+        <w:t>getT</w:t>
+      </w:r>
+      <w:r>
+        <w:rPr>
+          <w:b/>
+          <w:bCs/>
+          <w:color w:val="D86DCB" w:themeColor="accent5" w:themeTint="99"/>
+          <w:sz w:val="32"/>
+          <w:szCs w:val="32"/>
+        </w:rPr>
+        <w:t>oken</w:t>
+      </w:r>
+      <w:proofErr w:type="spellEnd"/>
+      <w:r>
+        <w:rPr>
+          <w:b/>
+          <w:bCs/>
+          <w:color w:val="D86DCB" w:themeColor="accent5" w:themeTint="99"/>
+          <w:sz w:val="32"/>
+          <w:szCs w:val="32"/>
+        </w:rPr>
+        <w:t>,</w:t>
+      </w:r>
+    </w:p>
+    <w:p>
+      <w:pPr>
+        <w:jc w:val="both"/>
+        <w:rPr>
+          <w:b/>
+          <w:bCs/>
+          <w:color w:val="D86DCB" w:themeColor="accent5" w:themeTint="99"/>
+          <w:sz w:val="32"/>
+          <w:szCs w:val="32"/>
+        </w:rPr>
+      </w:pPr>
+      <w:r>
+        <w:rPr>
+          <w:b/>
+          <w:bCs/>
+          <w:color w:val="D86DCB" w:themeColor="accent5" w:themeTint="99"/>
+          <w:sz w:val="32"/>
+          <w:szCs w:val="32"/>
+        </w:rPr>
+        <w:t xml:space="preserve">     </w:t>
+      </w:r>
+      <w:r>
+        <w:rPr>
+          <w:b/>
+          <w:bCs/>
+          <w:color w:val="D86DCB" w:themeColor="accent5" w:themeTint="99"/>
+          <w:sz w:val="32"/>
+          <w:szCs w:val="32"/>
+        </w:rPr>
+        <w:t>…</w:t>
+      </w:r>
+    </w:p>
+    <w:p>
+      <w:pPr>
+        <w:jc w:val="both"/>
+        <w:rPr>
+          <w:b/>
+          <w:bCs/>
+          <w:color w:val="D86DCB" w:themeColor="accent5" w:themeTint="99"/>
+          <w:sz w:val="32"/>
+          <w:szCs w:val="32"/>
+        </w:rPr>
+      </w:pPr>
+      <w:r>
+        <w:rPr>
+          <w:b/>
+          <w:bCs/>
+          <w:color w:val="D86DCB" w:themeColor="accent5" w:themeTint="99"/>
+          <w:sz w:val="32"/>
+          <w:szCs w:val="32"/>
+        </w:rPr>
+        <w:t>}</w:t>
+      </w:r>
+    </w:p>
+    <w:p>
+      <w:pPr>
+        <w:jc w:val="both"/>
+        <w:rPr>
+          <w:b/>
+          <w:bCs/>
+          <w:color w:val="D86DCB" w:themeColor="accent5" w:themeTint="99"/>
+          <w:sz w:val="32"/>
+          <w:szCs w:val="32"/>
+        </w:rPr>
+      </w:pPr>
+      <w:r>
+        <w:rPr>
+          <w:b/>
+          <w:bCs/>
+          <w:color w:val="D86DCB" w:themeColor="accent5" w:themeTint="99"/>
+          <w:sz w:val="32"/>
+          <w:szCs w:val="32"/>
+        </w:rPr>
+        <w:t xml:space="preserve">final </w:t>
+      </w:r>
+      <w:proofErr w:type="spellStart"/>
+      <w:r>
+        <w:rPr>
+          <w:b/>
+          <w:bCs/>
+          <w:color w:val="D86DCB" w:themeColor="accent5" w:themeTint="99"/>
+          <w:sz w:val="32"/>
+          <w:szCs w:val="32"/>
+        </w:rPr>
+        <w:t>apiCaller</w:t>
+      </w:r>
+      <w:proofErr w:type="spellEnd"/>
+      <w:r>
+        <w:rPr>
+          <w:b/>
+          <w:bCs/>
+          <w:color w:val="D86DCB" w:themeColor="accent5" w:themeTint="99"/>
+          <w:sz w:val="32"/>
+          <w:szCs w:val="32"/>
+        </w:rPr>
+        <w:t xml:space="preserve"> = </w:t>
+      </w:r>
+      <w:proofErr w:type="spellStart"/>
+      <w:r>
+        <w:rPr>
+          <w:b/>
+          <w:bCs/>
+          <w:color w:val="D86DCB" w:themeColor="accent5" w:themeTint="99"/>
+          <w:sz w:val="32"/>
+          <w:szCs w:val="32"/>
+        </w:rPr>
+        <w:t>APICaller</w:t>
+      </w:r>
+      <w:proofErr w:type="spellEnd"/>
+      <w:r>
+        <w:rPr>
+          <w:b/>
+          <w:bCs/>
+          <w:color w:val="D86DCB" w:themeColor="accent5" w:themeTint="99"/>
+          <w:sz w:val="32"/>
+          <w:szCs w:val="32"/>
+        </w:rPr>
+        <w:t>(</w:t>
+      </w:r>
+      <w:proofErr w:type="spellStart"/>
+      <w:r>
+        <w:rPr>
+          <w:b/>
+          <w:bCs/>
+          <w:color w:val="D86DCB" w:themeColor="accent5" w:themeTint="99"/>
+          <w:sz w:val="32"/>
+          <w:szCs w:val="32"/>
+        </w:rPr>
+        <w:t>getT</w:t>
+      </w:r>
+      <w:r>
+        <w:rPr>
+          <w:b/>
+          <w:bCs/>
+          <w:color w:val="D86DCB" w:themeColor="accent5" w:themeTint="99"/>
+          <w:sz w:val="32"/>
+          <w:szCs w:val="32"/>
+        </w:rPr>
+        <w:t>oken</w:t>
+      </w:r>
+      <w:proofErr w:type="spellEnd"/>
+      <w:r>
+        <w:rPr>
+          <w:b/>
+          <w:bCs/>
+          <w:color w:val="D86DCB" w:themeColor="accent5" w:themeTint="99"/>
+          <w:sz w:val="32"/>
+          <w:szCs w:val="32"/>
+        </w:rPr>
+        <w:t xml:space="preserve">: () =&gt; </w:t>
+      </w:r>
+      <w:proofErr w:type="spellStart"/>
+      <w:r>
+        <w:rPr>
+          <w:b/>
+          <w:bCs/>
+          <w:color w:val="D86DCB" w:themeColor="accent5" w:themeTint="99"/>
+          <w:sz w:val="32"/>
+          <w:szCs w:val="32"/>
+        </w:rPr>
+        <w:t>AuthProvider.token</w:t>
+      </w:r>
+      <w:proofErr w:type="spellEnd"/>
+      <w:r>
+        <w:rPr>
+          <w:b/>
+          <w:bCs/>
+          <w:color w:val="D86DCB" w:themeColor="accent5" w:themeTint="99"/>
+          <w:sz w:val="32"/>
+          <w:szCs w:val="32"/>
+        </w:rPr>
+        <w:t>);</w:t>
+      </w:r>
+    </w:p>
+    <w:p>
+      <w:pPr>
+        <w:jc w:val="both"/>
+        <w:rPr>
+          <w:sz w:val="32"/>
+          <w:szCs w:val="32"/>
+        </w:rPr>
+      </w:pPr>
+    </w:p>
+    <w:p>
+      <w:pPr>
+        <w:jc w:val="both"/>
+        <w:rPr>
+          <w:sz w:val="32"/>
+          <w:szCs w:val="32"/>
+        </w:rPr>
+      </w:pPr>
+      <w:r>
+        <w:rPr>
+          <w:b/>
+          <w:bCs/>
+          <w:sz w:val="32"/>
+          <w:szCs w:val="32"/>
+        </w:rPr>
+        <w:t>N</w:t>
+      </w:r>
+      <w:r>
+        <w:rPr>
+          <w:b/>
+          <w:bCs/>
+          <w:sz w:val="32"/>
+          <w:szCs w:val="32"/>
+        </w:rPr>
+        <w:t>OTE</w:t>
+      </w:r>
+      <w:r>
+        <w:rPr>
+          <w:b/>
+          <w:bCs/>
+          <w:sz w:val="32"/>
+          <w:szCs w:val="32"/>
+        </w:rPr>
+        <w:t>:</w:t>
+      </w:r>
+      <w:r>
+        <w:rPr>
+          <w:sz w:val="32"/>
+          <w:szCs w:val="32"/>
+        </w:rPr>
+        <w:t xml:space="preserve"> Use this when we want to get the latest data from a class instead of using the old one</w:t>
+      </w:r>
+      <w:r>
+        <w:rPr>
+          <w:sz w:val="32"/>
+          <w:szCs w:val="32"/>
+        </w:rPr>
+        <w:t xml:space="preserve"> (snapshot)</w:t>
+      </w:r>
+      <w:r>
+        <w:rPr>
+          <w:sz w:val="32"/>
+          <w:szCs w:val="32"/>
+        </w:rPr>
+        <w:t xml:space="preserve">. </w:t>
+      </w:r>
+      <w:r>
+        <w:rPr>
+          <w:sz w:val="32"/>
+          <w:szCs w:val="32"/>
+        </w:rPr>
+        <w:t>It’s</w:t>
+      </w:r>
       <w:r>
         <w:rPr>
           <w:sz w:val="32"/>
@@ -1642,7 +2195,6 @@
         <w:t xml:space="preserve"> like </w:t>
       </w:r>
       <w:proofErr w:type="spellStart"/>
-      <w:proofErr w:type="gramStart"/>
       <w:r>
         <w:rPr>
           <w:b/>
@@ -1660,17 +2212,7 @@
           <w:sz w:val="32"/>
           <w:szCs w:val="32"/>
         </w:rPr>
-        <w:t>(</w:t>
-      </w:r>
-      <w:proofErr w:type="gramEnd"/>
-      <w:r>
-        <w:rPr>
-          <w:b/>
-          <w:bCs/>
-          <w:sz w:val="32"/>
-          <w:szCs w:val="32"/>
-        </w:rPr>
-        <w:t>)</w:t>
+        <w:t>()</w:t>
       </w:r>
       <w:r>
         <w:rPr>
@@ -1679,6 +2221,15 @@
         </w:rPr>
         <w:t xml:space="preserve"> when called every time it gets the lates token. Here instead of a callback think of it like a passable parameter in classes or methods.</w:t>
       </w:r>
+    </w:p>
+    <w:p>
+      <w:pPr>
+        <w:jc w:val="both"/>
+        <w:rPr>
+          <w:sz w:val="32"/>
+          <w:szCs w:val="32"/>
+        </w:rPr>
+      </w:pPr>
     </w:p>
     <w:p>
       <w:pPr>
@@ -1782,7 +2333,6 @@
         </w:rPr>
         <w:tab/>
       </w:r>
-      <w:proofErr w:type="gramStart"/>
       <w:r>
         <w:rPr>
           <w:sz w:val="32"/>
@@ -1798,18 +2348,7 @@
           <w:sz w:val="32"/>
           <w:szCs w:val="32"/>
         </w:rPr>
-        <w:t>( )</w:t>
-      </w:r>
-      <w:proofErr w:type="gramEnd"/>
-      <w:r>
-        <w:rPr>
-          <w:b/>
-          <w:bCs/>
-          <w:color w:val="D86DCB" w:themeColor="accent5" w:themeTint="99"/>
-          <w:sz w:val="32"/>
-          <w:szCs w:val="32"/>
-        </w:rPr>
-        <w:t xml:space="preserve"> {  }</w:t>
+        <w:t>( ) {  }</w:t>
       </w:r>
     </w:p>
     <w:p>
@@ -1951,15 +2490,7 @@
           <w:sz w:val="32"/>
           <w:szCs w:val="32"/>
         </w:rPr>
-        <w:t xml:space="preserve"># This calls </w:t>
-      </w:r>
-      <w:proofErr w:type="gramStart"/>
-      <w:r>
-        <w:rPr>
-          <w:sz w:val="32"/>
-          <w:szCs w:val="32"/>
-        </w:rPr>
-        <w:t xml:space="preserve">the  </w:t>
+        <w:t xml:space="preserve"># This calls the </w:t>
       </w:r>
       <w:proofErr w:type="spellStart"/>
       <w:r>
@@ -1970,7 +2501,6 @@
         <w:t>cancelNewTask</w:t>
       </w:r>
       <w:proofErr w:type="spellEnd"/>
-      <w:proofErr w:type="gramEnd"/>
       <w:r>
         <w:rPr>
           <w:sz w:val="32"/>
@@ -2013,7 +2543,6 @@
         <w:t xml:space="preserve">: () =&gt; </w:t>
       </w:r>
       <w:proofErr w:type="spellStart"/>
-      <w:proofErr w:type="gramStart"/>
       <w:r>
         <w:rPr>
           <w:b/>
@@ -2033,18 +2562,7 @@
           <w:sz w:val="32"/>
           <w:szCs w:val="32"/>
         </w:rPr>
-        <w:t>(</w:t>
-      </w:r>
-      <w:proofErr w:type="gramEnd"/>
-      <w:r>
-        <w:rPr>
-          <w:b/>
-          <w:bCs/>
-          <w:color w:val="D86DCB" w:themeColor="accent5" w:themeTint="99"/>
-          <w:sz w:val="32"/>
-          <w:szCs w:val="32"/>
-        </w:rPr>
-        <w:t>),</w:t>
+        <w:t>(),</w:t>
       </w:r>
     </w:p>
     <w:p>

</xml_diff>